<commit_message>
Prompts v2.1: special-situation accounting + no-fabricated-precision rule
</commit_message>
<xml_diff>
--- a/FinTech_Monitor_Prompts_v2.docx
+++ b/FinTech_Monitor_Prompts_v2.docx
@@ -212,16 +212,34 @@
         <w:rPr>
           <w:rStyle w:val="VerbatimChar"/>
         </w:rPr>
-        <w:t xml:space="preserve">- Short, declarative sentences. No filler closers ("automate or get left behind," "no longer a</w:t>
-      </w:r>
-      <w:r>
-        <w:br/>
-      </w:r>
-      <w:r>
-        <w:rPr>
-          <w:rStyle w:val="VerbatimChar"/>
-        </w:rPr>
-        <w:t xml:space="preserve">  luxury"). End on ONE specific, dated, falsifiable implication (a "by 2029…" bet).</w:t>
+        <w:t xml:space="preserve">- Short, declarative sentences, but let them flow — avoid choppy fragments. No filler closers</w:t>
+      </w:r>
+      <w:r>
+        <w:br/>
+      </w:r>
+      <w:r>
+        <w:rPr>
+          <w:rStyle w:val="VerbatimChar"/>
+        </w:rPr>
+        <w:t xml:space="preserve">  ("automate or get left behind," "no longer a luxury"). End on ONE specific, dated, falsifiable</w:t>
+      </w:r>
+      <w:r>
+        <w:br/>
+      </w:r>
+      <w:r>
+        <w:rPr>
+          <w:rStyle w:val="VerbatimChar"/>
+        </w:rPr>
+        <w:t xml:space="preserve">  implication — frame it explicitly as a forecast ("Our bet: by 2029…"); NEVER state an invented</w:t>
+      </w:r>
+      <w:r>
+        <w:br/>
+      </w:r>
+      <w:r>
+        <w:rPr>
+          <w:rStyle w:val="VerbatimChar"/>
+        </w:rPr>
+        <w:t xml:space="preserve">  statistic as if it were fact.</w:t>
       </w:r>
       <w:r>
         <w:br/>
@@ -260,7 +278,52 @@
         <w:rPr>
           <w:rStyle w:val="VerbatimChar"/>
         </w:rPr>
-        <w:t xml:space="preserve">  and debt into one number. Mark undisclosed amounts as such.</w:t>
+        <w:t xml:space="preserve">  and debt into one number. Primary capital = EQUITY only; report debt separately. Mark</w:t>
+      </w:r>
+      <w:r>
+        <w:br/>
+      </w:r>
+      <w:r>
+        <w:rPr>
+          <w:rStyle w:val="VerbatimChar"/>
+        </w:rPr>
+        <w:t xml:space="preserve">  undisclosed amounts as such.</w:t>
+      </w:r>
+      <w:r>
+        <w:br/>
+      </w:r>
+      <w:r>
+        <w:rPr>
+          <w:rStyle w:val="VerbatimChar"/>
+        </w:rPr>
+        <w:t xml:space="preserve">- A deal flagged as NOT this subsector (a "special situation" — e.g. an adjacent-sector company a</w:t>
+      </w:r>
+      <w:r>
+        <w:br/>
+      </w:r>
+      <w:r>
+        <w:rPr>
+          <w:rStyle w:val="VerbatimChar"/>
+        </w:rPr>
+        <w:t xml:space="preserve">  CVC backed) is EXCLUDED from the deal count and the primary-capital total; report it separately</w:t>
+      </w:r>
+      <w:r>
+        <w:br/>
+      </w:r>
+      <w:r>
+        <w:rPr>
+          <w:rStyle w:val="VerbatimChar"/>
+        </w:rPr>
+        <w:t xml:space="preserve">  as "plus [n] special situation," mirroring the benchmark's "Four deals. $44M+. Plus a special</w:t>
+      </w:r>
+      <w:r>
+        <w:br/>
+      </w:r>
+      <w:r>
+        <w:rPr>
+          <w:rStyle w:val="VerbatimChar"/>
+        </w:rPr>
+        <w:t xml:space="preserve">  situation."</w:t>
       </w:r>
       <w:r>
         <w:br/>
@@ -461,7 +524,25 @@
         <w:rPr>
           <w:rStyle w:val="VerbatimChar"/>
         </w:rPr>
-        <w:t xml:space="preserve">Anchor every number to the Tape; never estimate. Cite sources.</w:t>
+        <w:t xml:space="preserve">Anchor every number to the Tape; never estimate or invent figures (including in forward bets —</w:t>
+      </w:r>
+      <w:r>
+        <w:br/>
+      </w:r>
+      <w:r>
+        <w:rPr>
+          <w:rStyle w:val="VerbatimChar"/>
+        </w:rPr>
+        <w:t xml:space="preserve">frame those as explicit forecasts). If the Tape is absent, say so (e.g. rotation cannot be</w:t>
+      </w:r>
+      <w:r>
+        <w:br/>
+      </w:r>
+      <w:r>
+        <w:rPr>
+          <w:rStyle w:val="VerbatimChar"/>
+        </w:rPr>
+        <w:t xml:space="preserve">computed) rather than fabricating. Cite sources.</w:t>
       </w:r>
     </w:p>
     <w:p>

</xml_diff>

<commit_message>
Prompts: count all real deals incl context (benchmark convention)
</commit_message>
<xml_diff>
--- a/FinTech_Monitor_Prompts_v2.docx
+++ b/FinTech_Monitor_Prompts_v2.docx
@@ -324,6 +324,24 @@
           <w:rStyle w:val="VerbatimChar"/>
         </w:rPr>
         <w:t xml:space="preserve">  situation."</w:t>
+      </w:r>
+      <w:r>
+        <w:br/>
+      </w:r>
+      <w:r>
+        <w:rPr>
+          <w:rStyle w:val="VerbatimChar"/>
+        </w:rPr>
+        <w:t xml:space="preserve">- [N] counts EVERY real deal in the period, including sub-threshold Context/Watch raises (this is</w:t>
+      </w:r>
+      <w:r>
+        <w:br/>
+      </w:r>
+      <w:r>
+        <w:rPr>
+          <w:rStyle w:val="VerbatimChar"/>
+        </w:rPr>
+        <w:t xml:space="preserve">  how the benchmark counts) — only special situations are excluded. Optionally note "X tracked / Y context."</w:t>
       </w:r>
       <w:r>
         <w:br/>

</xml_diff>